<commit_message>
docs: update Phase 3 report after TA feedback
</commit_message>
<xml_diff>
--- a/docs/phase-3/COSC336_Phase3_Requirements_Report.docx
+++ b/docs/phase-3/COSC336_Phase3_Requirements_Report.docx
@@ -926,7 +926,7 @@
     <w:p>
       <w:pPr/>
       <w:r>
-        <w:t>The requirements are a proposed prototype baseline, not evidence that the software has been implemented or that KU has approved its operating rules. Requirements elicitation combines the course documents with the simulated stakeholder interview in Appendix A, an exercise permitted by the professor. The questions and answers are fictional and explicitly labelled; they develop and examine requirements rather than report an actual meeting. KU-specific procedures, role assignments, approval authority and demand remain assumptions requiring institutional confirmation only before a live pilot. A real interview is not a prerequisite for this classroom elicitation exercise.</w:t>
+        <w:t>The requirements are a proposed prototype baseline, not evidence that the software has been implemented or that KU has approved its operating rules. Requirements elicitation combines document analysis of the project brief with the simulated stakeholder interview in Appendix A. The interview answers are fictional and labelled as such. KU-specific procedures, role assignments, approval authority and demand remain assumptions to confirm before any live pilot.</w:t>
       </w:r>
     </w:p>
     <w:p>
@@ -950,50 +950,36 @@
       </w:r>
     </w:p>
     <w:p>
+      <w:r>
+        <w:br w:type="page"/>
+      </w:r>
+    </w:p>
+    <w:p>
+      <w:pPr>
+        <w:pStyle w:val="Heading1"/>
+      </w:pPr>
+      <w:r>
+        <w:t>2 System Context and Scope</w:t>
+      </w:r>
+    </w:p>
+    <w:p>
       <w:pPr>
         <w:pStyle w:val="Heading2"/>
       </w:pPr>
       <w:r>
-        <w:t>Submission and development context</w:t>
+        <w:t>Intended users and problem</w:t>
       </w:r>
     </w:p>
     <w:p>
       <w:pPr/>
       <w:r>
-        <w:t>The COSC 336 B3 Blackboard Phase 3 assignment page lists the submission deadline as 13 October 2026 at 18:00 UAE time UTC+4, after a one-day extension, as checked on 5 October [6]. This submission entry supersedes the earlier week-of-5-October milestone in slide 2 [1]. It does not establish a separate presentation date or change later milestones. The slide schedule still places design in the week of 26 October, draft implementation in the week of 16 November, and testing and final demonstration in the week of 23 November.</w:t>
-      </w:r>
-    </w:p>
-    <w:p>
-      <w:r>
-        <w:br w:type="page"/>
-      </w:r>
-    </w:p>
-    <w:p>
-      <w:pPr>
-        <w:pStyle w:val="Heading1"/>
-      </w:pPr>
-      <w:r>
-        <w:t>2 System Context and Scope</w:t>
-      </w:r>
-    </w:p>
-    <w:p>
-      <w:pPr>
-        <w:pStyle w:val="Heading2"/>
-      </w:pPr>
-      <w:r>
-        <w:t>Intended users and problem</w:t>
+        <w:t>The proposed system serves departments that hold reusable assets and departments that need compatible resources. A requester needs to find suitable items and track a request. A custodian needs an accurate inventory and evidence of who released and received each asset. Approvers need purpose, eligibility and ownership information before deciding. Maintenance staff need a linked inspection and repair record. Finance and sustainability staff need calculations whose inputs can be checked.</w:t>
       </w:r>
     </w:p>
     <w:p>
       <w:pPr/>
       <w:r>
-        <w:t>The proposed system serves departments that hold reusable assets and departments that need compatible resources. A requester needs to find suitable items and track a request. A custodian needs an accurate inventory and evidence of who released and received each asset. Approvers need purpose, eligibility and ownership information before deciding. Maintenance staff need a linked inspection and repair record. Finance and sustainability staff need calculations whose inputs can be checked.</w:t>
-      </w:r>
-    </w:p>
-    <w:p>
-      <w:pPr/>
-      <w:r>
-        <w:t>The interview scenario assumes that resource requests, approval messages, asset registers and maintenance records are held in separate emails, forms or spreadsheets. Appendix A explores how that fictional workflow creates requirements for availability, approval, custody and reporting. It does not establish KU's actual process, use of a named product, measured delays or lack of an existing workflow. Snipe-IT and Warp-it were reviewed as existing alternatives in Phase 2 [3]. Snipe-IT remains a comparison candidate, not a selected or approved implementation route. The Phase 3 slides identify Python, Java or C++ for the prototype [1]; any adaptation route must be checked against that constraint with the instructor before commitment.</w:t>
+        <w:t>The interview scenario assumes that resource requests, approval messages, asset registers and maintenance records are held in separate emails, forms or spreadsheets. Appendix A explores how that fictional workflow creates requirements for availability, approval, custody and reporting. It does not establish KU's actual process, use of a named product, measured delays or lack of an existing workflow. Snipe-IT and Warp-it were reviewed as existing alternatives in Phase 2 [3]. Snipe-IT remains a comparison candidate, not a selected or approved implementation route. The prototype shall be implemented in Python, Java or C++ [1].</w:t>
       </w:r>
     </w:p>
     <w:p>
@@ -1400,13 +1386,1172 @@
         <w:pStyle w:val="Heading2"/>
       </w:pPr>
       <w:r>
+        <w:t>Prototype 1 priorities</w:t>
+      </w:r>
+    </w:p>
+    <w:p>
+      <w:pPr/>
+      <w:r>
+        <w:t>Prototype 1 is the working demonstration the team will build in the six weeks before the Phase 6 deadline. Building all 38 use cases and 121 functional requirements in that time is not feasible, so Prototype 1 implements one complete end-to-end path: register and classify an asset, publish it, find it by structured and AI search, request it, reserve and approve it, release and receive it, handle a fault, and report the results. This covers the minimum prototype listed in the project brief [2]. Accounts, departments and benefit inputs are loaded as seed data for the demo instead of having their own screens.</w:t>
+      </w:r>
+    </w:p>
+    <w:tbl>
+      <w:tblPr>
+        <w:tblW w:type="auto" w:w="0"/>
+        <w:jc w:val="center"/>
+        <w:tblLayout w:type="fixed"/>
+        <w:tblLook w:firstColumn="1" w:firstRow="1" w:lastColumn="0" w:lastRow="0" w:noHBand="0" w:noVBand="1" w:val="04A0"/>
+        <w:tblBorders>
+          <w:top w:val="single" w:sz="4" w:color="D9D9D9"/>
+          <w:left w:val="single" w:sz="4" w:color="D9D9D9"/>
+          <w:bottom w:val="single" w:sz="4" w:color="D9D9D9"/>
+          <w:right w:val="single" w:sz="4" w:color="D9D9D9"/>
+          <w:insideH w:val="single" w:sz="4" w:color="D9D9D9"/>
+          <w:insideV w:val="single" w:sz="4" w:color="D9D9D9"/>
+        </w:tblBorders>
+      </w:tblPr>
+      <w:tblGrid>
+        <w:gridCol w:w="3504"/>
+        <w:gridCol w:w="3504"/>
+        <w:gridCol w:w="3504"/>
+      </w:tblGrid>
+      <w:tr>
+        <w:trPr>
+          <w:cantSplit/>
+          <w:tblHeader/>
+        </w:trPr>
+        <w:tc>
+          <w:tcPr>
+            <w:tcW w:type="dxa" w:w="2313"/>
+            <w:vAlign w:val="center"/>
+            <w:shd w:fill="21364B"/>
+            <w:tcMar>
+              <w:top w:w="80" w:type="dxa"/>
+              <w:bottom w:w="80" w:type="dxa"/>
+              <w:left w:w="90" w:type="dxa"/>
+              <w:right w:w="90" w:type="dxa"/>
+            </w:tcMar>
+          </w:tcPr>
+          <w:p>
+            <w:pPr>
+              <w:spacing w:after="0" w:line="252" w:lineRule="auto"/>
+            </w:pPr>
+            <w:r>
+              <w:rPr>
+                <w:b/>
+                <w:color w:val="FFFFFF"/>
+                <w:sz w:val="19"/>
+              </w:rPr>
+              <w:t>Demo step</w:t>
+            </w:r>
+          </w:p>
+        </w:tc>
+        <w:tc>
+          <w:tcPr>
+            <w:tcW w:type="dxa" w:w="4205"/>
+            <w:vAlign w:val="center"/>
+            <w:shd w:fill="21364B"/>
+            <w:tcMar>
+              <w:top w:w="80" w:type="dxa"/>
+              <w:bottom w:w="80" w:type="dxa"/>
+              <w:left w:w="90" w:type="dxa"/>
+              <w:right w:w="90" w:type="dxa"/>
+            </w:tcMar>
+          </w:tcPr>
+          <w:p>
+            <w:pPr>
+              <w:spacing w:after="0" w:line="252" w:lineRule="auto"/>
+            </w:pPr>
+            <w:r>
+              <w:rPr>
+                <w:b/>
+                <w:color w:val="FFFFFF"/>
+                <w:sz w:val="19"/>
+              </w:rPr>
+              <w:t>Prototype 1 use cases</w:t>
+            </w:r>
+          </w:p>
+        </w:tc>
+        <w:tc>
+          <w:tcPr>
+            <w:tcW w:type="dxa" w:w="3995"/>
+            <w:vAlign w:val="center"/>
+            <w:shd w:fill="21364B"/>
+            <w:tcMar>
+              <w:top w:w="80" w:type="dxa"/>
+              <w:bottom w:w="80" w:type="dxa"/>
+              <w:left w:w="90" w:type="dxa"/>
+              <w:right w:w="90" w:type="dxa"/>
+            </w:tcMar>
+          </w:tcPr>
+          <w:p>
+            <w:pPr>
+              <w:spacing w:after="0" w:line="252" w:lineRule="auto"/>
+            </w:pPr>
+            <w:r>
+              <w:rPr>
+                <w:b/>
+                <w:color w:val="FFFFFF"/>
+                <w:sz w:val="19"/>
+              </w:rPr>
+              <w:t>Owner</w:t>
+            </w:r>
+          </w:p>
+        </w:tc>
+      </w:tr>
+      <w:tr>
+        <w:trPr>
+          <w:cantSplit/>
+        </w:trPr>
+        <w:tc>
+          <w:tcPr>
+            <w:tcW w:type="dxa" w:w="2313"/>
+            <w:vAlign w:val="center"/>
+            <w:shd w:fill="FFFFFF"/>
+            <w:tcMar>
+              <w:top w:w="80" w:type="dxa"/>
+              <w:bottom w:w="80" w:type="dxa"/>
+              <w:left w:w="90" w:type="dxa"/>
+              <w:right w:w="90" w:type="dxa"/>
+            </w:tcMar>
+          </w:tcPr>
+          <w:p>
+            <w:pPr>
+              <w:spacing w:after="0" w:line="252" w:lineRule="auto"/>
+            </w:pPr>
+            <w:r>
+              <w:rPr>
+                <w:b w:val="0"/>
+                <w:color w:val="000000"/>
+                <w:sz w:val="19"/>
+              </w:rPr>
+              <w:t>Sign in with a role</w:t>
+            </w:r>
+          </w:p>
+        </w:tc>
+        <w:tc>
+          <w:tcPr>
+            <w:tcW w:type="dxa" w:w="4205"/>
+            <w:vAlign w:val="center"/>
+            <w:shd w:fill="FFFFFF"/>
+            <w:tcMar>
+              <w:top w:w="80" w:type="dxa"/>
+              <w:bottom w:w="80" w:type="dxa"/>
+              <w:left w:w="90" w:type="dxa"/>
+              <w:right w:w="90" w:type="dxa"/>
+            </w:tcMar>
+          </w:tcPr>
+          <w:p>
+            <w:pPr>
+              <w:spacing w:after="0" w:line="252" w:lineRule="auto"/>
+            </w:pPr>
+            <w:r>
+              <w:rPr>
+                <w:b w:val="0"/>
+                <w:color w:val="000000"/>
+                <w:sz w:val="19"/>
+              </w:rPr>
+              <w:t>UC-01 Sign in</w:t>
+            </w:r>
+          </w:p>
+        </w:tc>
+        <w:tc>
+          <w:tcPr>
+            <w:tcW w:type="dxa" w:w="3995"/>
+            <w:vAlign w:val="center"/>
+            <w:shd w:fill="FFFFFF"/>
+            <w:tcMar>
+              <w:top w:w="80" w:type="dxa"/>
+              <w:bottom w:w="80" w:type="dxa"/>
+              <w:left w:w="90" w:type="dxa"/>
+              <w:right w:w="90" w:type="dxa"/>
+            </w:tcMar>
+          </w:tcPr>
+          <w:p>
+            <w:pPr>
+              <w:spacing w:after="0" w:line="252" w:lineRule="auto"/>
+            </w:pPr>
+            <w:r>
+              <w:rPr>
+                <w:b w:val="0"/>
+                <w:color w:val="000000"/>
+                <w:sz w:val="19"/>
+              </w:rPr>
+              <w:t>Ali</w:t>
+            </w:r>
+          </w:p>
+        </w:tc>
+      </w:tr>
+      <w:tr>
+        <w:trPr>
+          <w:cantSplit/>
+        </w:trPr>
+        <w:tc>
+          <w:tcPr>
+            <w:tcW w:type="dxa" w:w="2313"/>
+            <w:vAlign w:val="center"/>
+            <w:shd w:fill="F3F6F8"/>
+            <w:tcMar>
+              <w:top w:w="80" w:type="dxa"/>
+              <w:bottom w:w="80" w:type="dxa"/>
+              <w:left w:w="90" w:type="dxa"/>
+              <w:right w:w="90" w:type="dxa"/>
+            </w:tcMar>
+          </w:tcPr>
+          <w:p>
+            <w:pPr>
+              <w:spacing w:after="0" w:line="252" w:lineRule="auto"/>
+            </w:pPr>
+            <w:r>
+              <w:rPr>
+                <w:b w:val="0"/>
+                <w:color w:val="000000"/>
+                <w:sz w:val="19"/>
+              </w:rPr>
+              <w:t>Register, classify and publish</w:t>
+            </w:r>
+          </w:p>
+        </w:tc>
+        <w:tc>
+          <w:tcPr>
+            <w:tcW w:type="dxa" w:w="4205"/>
+            <w:vAlign w:val="center"/>
+            <w:shd w:fill="F3F6F8"/>
+            <w:tcMar>
+              <w:top w:w="80" w:type="dxa"/>
+              <w:bottom w:w="80" w:type="dxa"/>
+              <w:left w:w="90" w:type="dxa"/>
+              <w:right w:w="90" w:type="dxa"/>
+            </w:tcMar>
+          </w:tcPr>
+          <w:p>
+            <w:pPr>
+              <w:spacing w:after="0" w:line="252" w:lineRule="auto"/>
+            </w:pPr>
+            <w:r>
+              <w:rPr>
+                <w:b w:val="0"/>
+                <w:color w:val="000000"/>
+                <w:sz w:val="19"/>
+              </w:rPr>
+              <w:t>UC-04 Register an asset, UC-31 Suggest asset classifications, UC-35 Review an AI recommendation, UC-06 Publish an asset</w:t>
+            </w:r>
+          </w:p>
+        </w:tc>
+        <w:tc>
+          <w:tcPr>
+            <w:tcW w:type="dxa" w:w="3995"/>
+            <w:vAlign w:val="center"/>
+            <w:shd w:fill="F3F6F8"/>
+            <w:tcMar>
+              <w:top w:w="80" w:type="dxa"/>
+              <w:bottom w:w="80" w:type="dxa"/>
+              <w:left w:w="90" w:type="dxa"/>
+              <w:right w:w="90" w:type="dxa"/>
+            </w:tcMar>
+          </w:tcPr>
+          <w:p>
+            <w:pPr>
+              <w:spacing w:after="0" w:line="252" w:lineRule="auto"/>
+            </w:pPr>
+            <w:r>
+              <w:rPr>
+                <w:b w:val="0"/>
+                <w:color w:val="000000"/>
+                <w:sz w:val="19"/>
+              </w:rPr>
+              <w:t>Saeed, Humaid</w:t>
+            </w:r>
+          </w:p>
+        </w:tc>
+      </w:tr>
+      <w:tr>
+        <w:trPr>
+          <w:cantSplit/>
+        </w:trPr>
+        <w:tc>
+          <w:tcPr>
+            <w:tcW w:type="dxa" w:w="2313"/>
+            <w:vAlign w:val="center"/>
+            <w:shd w:fill="FFFFFF"/>
+            <w:tcMar>
+              <w:top w:w="80" w:type="dxa"/>
+              <w:bottom w:w="80" w:type="dxa"/>
+              <w:left w:w="90" w:type="dxa"/>
+              <w:right w:w="90" w:type="dxa"/>
+            </w:tcMar>
+          </w:tcPr>
+          <w:p>
+            <w:pPr>
+              <w:spacing w:after="0" w:line="252" w:lineRule="auto"/>
+            </w:pPr>
+            <w:r>
+              <w:rPr>
+                <w:b w:val="0"/>
+                <w:color w:val="000000"/>
+                <w:sz w:val="19"/>
+              </w:rPr>
+              <w:t>Find a resource</w:t>
+            </w:r>
+          </w:p>
+        </w:tc>
+        <w:tc>
+          <w:tcPr>
+            <w:tcW w:type="dxa" w:w="4205"/>
+            <w:vAlign w:val="center"/>
+            <w:shd w:fill="FFFFFF"/>
+            <w:tcMar>
+              <w:top w:w="80" w:type="dxa"/>
+              <w:bottom w:w="80" w:type="dxa"/>
+              <w:left w:w="90" w:type="dxa"/>
+              <w:right w:w="90" w:type="dxa"/>
+            </w:tcMar>
+          </w:tcPr>
+          <w:p>
+            <w:pPr>
+              <w:spacing w:after="0" w:line="252" w:lineRule="auto"/>
+            </w:pPr>
+            <w:r>
+              <w:rPr>
+                <w:b w:val="0"/>
+                <w:color w:val="000000"/>
+                <w:sz w:val="19"/>
+              </w:rPr>
+              <w:t>UC-08 Search the asset catalogue, UC-32 Match resources semantically</w:t>
+            </w:r>
+          </w:p>
+        </w:tc>
+        <w:tc>
+          <w:tcPr>
+            <w:tcW w:type="dxa" w:w="3995"/>
+            <w:vAlign w:val="center"/>
+            <w:shd w:fill="FFFFFF"/>
+            <w:tcMar>
+              <w:top w:w="80" w:type="dxa"/>
+              <w:bottom w:w="80" w:type="dxa"/>
+              <w:left w:w="90" w:type="dxa"/>
+              <w:right w:w="90" w:type="dxa"/>
+            </w:tcMar>
+          </w:tcPr>
+          <w:p>
+            <w:pPr>
+              <w:spacing w:after="0" w:line="252" w:lineRule="auto"/>
+            </w:pPr>
+            <w:r>
+              <w:rPr>
+                <w:b w:val="0"/>
+                <w:color w:val="000000"/>
+                <w:sz w:val="19"/>
+              </w:rPr>
+              <w:t>Ali, Humaid</w:t>
+            </w:r>
+          </w:p>
+        </w:tc>
+      </w:tr>
+      <w:tr>
+        <w:trPr>
+          <w:cantSplit/>
+        </w:trPr>
+        <w:tc>
+          <w:tcPr>
+            <w:tcW w:type="dxa" w:w="2313"/>
+            <w:vAlign w:val="center"/>
+            <w:shd w:fill="F3F6F8"/>
+            <w:tcMar>
+              <w:top w:w="80" w:type="dxa"/>
+              <w:bottom w:w="80" w:type="dxa"/>
+              <w:left w:w="90" w:type="dxa"/>
+              <w:right w:w="90" w:type="dxa"/>
+            </w:tcMar>
+          </w:tcPr>
+          <w:p>
+            <w:pPr>
+              <w:spacing w:after="0" w:line="252" w:lineRule="auto"/>
+            </w:pPr>
+            <w:r>
+              <w:rPr>
+                <w:b w:val="0"/>
+                <w:color w:val="000000"/>
+                <w:sz w:val="19"/>
+              </w:rPr>
+              <w:t>Request, reserve and approve</w:t>
+            </w:r>
+          </w:p>
+        </w:tc>
+        <w:tc>
+          <w:tcPr>
+            <w:tcW w:type="dxa" w:w="4205"/>
+            <w:vAlign w:val="center"/>
+            <w:shd w:fill="F3F6F8"/>
+            <w:tcMar>
+              <w:top w:w="80" w:type="dxa"/>
+              <w:bottom w:w="80" w:type="dxa"/>
+              <w:left w:w="90" w:type="dxa"/>
+              <w:right w:w="90" w:type="dxa"/>
+            </w:tcMar>
+          </w:tcPr>
+          <w:p>
+            <w:pPr>
+              <w:spacing w:after="0" w:line="252" w:lineRule="auto"/>
+            </w:pPr>
+            <w:r>
+              <w:rPr>
+                <w:b w:val="0"/>
+                <w:color w:val="000000"/>
+                <w:sz w:val="19"/>
+              </w:rPr>
+              <w:t>UC-10 Submit a resource request, UC-13 Reserve eligible assets, UC-14 Review a resource request</w:t>
+            </w:r>
+          </w:p>
+        </w:tc>
+        <w:tc>
+          <w:tcPr>
+            <w:tcW w:type="dxa" w:w="3995"/>
+            <w:vAlign w:val="center"/>
+            <w:shd w:fill="F3F6F8"/>
+            <w:tcMar>
+              <w:top w:w="80" w:type="dxa"/>
+              <w:bottom w:w="80" w:type="dxa"/>
+              <w:left w:w="90" w:type="dxa"/>
+              <w:right w:w="90" w:type="dxa"/>
+            </w:tcMar>
+          </w:tcPr>
+          <w:p>
+            <w:pPr>
+              <w:spacing w:after="0" w:line="252" w:lineRule="auto"/>
+            </w:pPr>
+            <w:r>
+              <w:rPr>
+                <w:b w:val="0"/>
+                <w:color w:val="000000"/>
+                <w:sz w:val="19"/>
+              </w:rPr>
+              <w:t>Ali, Saeed</w:t>
+            </w:r>
+          </w:p>
+        </w:tc>
+      </w:tr>
+      <w:tr>
+        <w:trPr>
+          <w:cantSplit/>
+        </w:trPr>
+        <w:tc>
+          <w:tcPr>
+            <w:tcW w:type="dxa" w:w="2313"/>
+            <w:vAlign w:val="center"/>
+            <w:shd w:fill="FFFFFF"/>
+            <w:tcMar>
+              <w:top w:w="80" w:type="dxa"/>
+              <w:bottom w:w="80" w:type="dxa"/>
+              <w:left w:w="90" w:type="dxa"/>
+              <w:right w:w="90" w:type="dxa"/>
+            </w:tcMar>
+          </w:tcPr>
+          <w:p>
+            <w:pPr>
+              <w:spacing w:after="0" w:line="252" w:lineRule="auto"/>
+            </w:pPr>
+            <w:r>
+              <w:rPr>
+                <w:b w:val="0"/>
+                <w:color w:val="000000"/>
+                <w:sz w:val="19"/>
+              </w:rPr>
+              <w:t>Transfer</w:t>
+            </w:r>
+          </w:p>
+        </w:tc>
+        <w:tc>
+          <w:tcPr>
+            <w:tcW w:type="dxa" w:w="4205"/>
+            <w:vAlign w:val="center"/>
+            <w:shd w:fill="FFFFFF"/>
+            <w:tcMar>
+              <w:top w:w="80" w:type="dxa"/>
+              <w:bottom w:w="80" w:type="dxa"/>
+              <w:left w:w="90" w:type="dxa"/>
+              <w:right w:w="90" w:type="dxa"/>
+            </w:tcMar>
+          </w:tcPr>
+          <w:p>
+            <w:pPr>
+              <w:spacing w:after="0" w:line="252" w:lineRule="auto"/>
+            </w:pPr>
+            <w:r>
+              <w:rPr>
+                <w:b w:val="0"/>
+                <w:color w:val="000000"/>
+                <w:sz w:val="19"/>
+              </w:rPr>
+              <w:t>UC-16 Release reserved assets, UC-17 Confirm asset receipt</w:t>
+            </w:r>
+          </w:p>
+        </w:tc>
+        <w:tc>
+          <w:tcPr>
+            <w:tcW w:type="dxa" w:w="3995"/>
+            <w:vAlign w:val="center"/>
+            <w:shd w:fill="FFFFFF"/>
+            <w:tcMar>
+              <w:top w:w="80" w:type="dxa"/>
+              <w:bottom w:w="80" w:type="dxa"/>
+              <w:left w:w="90" w:type="dxa"/>
+              <w:right w:w="90" w:type="dxa"/>
+            </w:tcMar>
+          </w:tcPr>
+          <w:p>
+            <w:pPr>
+              <w:spacing w:after="0" w:line="252" w:lineRule="auto"/>
+            </w:pPr>
+            <w:r>
+              <w:rPr>
+                <w:b w:val="0"/>
+                <w:color w:val="000000"/>
+                <w:sz w:val="19"/>
+              </w:rPr>
+              <w:t>Saeed</w:t>
+            </w:r>
+          </w:p>
+        </w:tc>
+      </w:tr>
+      <w:tr>
+        <w:trPr>
+          <w:cantSplit/>
+        </w:trPr>
+        <w:tc>
+          <w:tcPr>
+            <w:tcW w:type="dxa" w:w="2313"/>
+            <w:vAlign w:val="center"/>
+            <w:shd w:fill="F3F6F8"/>
+            <w:tcMar>
+              <w:top w:w="80" w:type="dxa"/>
+              <w:bottom w:w="80" w:type="dxa"/>
+              <w:left w:w="90" w:type="dxa"/>
+              <w:right w:w="90" w:type="dxa"/>
+            </w:tcMar>
+          </w:tcPr>
+          <w:p>
+            <w:pPr>
+              <w:spacing w:after="0" w:line="252" w:lineRule="auto"/>
+            </w:pPr>
+            <w:r>
+              <w:rPr>
+                <w:b w:val="0"/>
+                <w:color w:val="000000"/>
+                <w:sz w:val="19"/>
+              </w:rPr>
+              <w:t>Maintenance</w:t>
+            </w:r>
+          </w:p>
+        </w:tc>
+        <w:tc>
+          <w:tcPr>
+            <w:tcW w:type="dxa" w:w="4205"/>
+            <w:vAlign w:val="center"/>
+            <w:shd w:fill="F3F6F8"/>
+            <w:tcMar>
+              <w:top w:w="80" w:type="dxa"/>
+              <w:bottom w:w="80" w:type="dxa"/>
+              <w:left w:w="90" w:type="dxa"/>
+              <w:right w:w="90" w:type="dxa"/>
+            </w:tcMar>
+          </w:tcPr>
+          <w:p>
+            <w:pPr>
+              <w:spacing w:after="0" w:line="252" w:lineRule="auto"/>
+            </w:pPr>
+            <w:r>
+              <w:rPr>
+                <w:b w:val="0"/>
+                <w:color w:val="000000"/>
+                <w:sz w:val="19"/>
+              </w:rPr>
+              <w:t>UC-20 Report an asset fault, UC-22 Complete asset maintenance, UC-19 Record an asset inspection</w:t>
+            </w:r>
+          </w:p>
+        </w:tc>
+        <w:tc>
+          <w:tcPr>
+            <w:tcW w:type="dxa" w:w="3995"/>
+            <w:vAlign w:val="center"/>
+            <w:shd w:fill="F3F6F8"/>
+            <w:tcMar>
+              <w:top w:w="80" w:type="dxa"/>
+              <w:bottom w:w="80" w:type="dxa"/>
+              <w:left w:w="90" w:type="dxa"/>
+              <w:right w:w="90" w:type="dxa"/>
+            </w:tcMar>
+          </w:tcPr>
+          <w:p>
+            <w:pPr>
+              <w:spacing w:after="0" w:line="252" w:lineRule="auto"/>
+            </w:pPr>
+            <w:r>
+              <w:rPr>
+                <w:b w:val="0"/>
+                <w:color w:val="000000"/>
+                <w:sz w:val="19"/>
+              </w:rPr>
+              <w:t>Ali</w:t>
+            </w:r>
+          </w:p>
+        </w:tc>
+      </w:tr>
+      <w:tr>
+        <w:trPr>
+          <w:cantSplit/>
+        </w:trPr>
+        <w:tc>
+          <w:tcPr>
+            <w:tcW w:type="dxa" w:w="2313"/>
+            <w:vAlign w:val="center"/>
+            <w:shd w:fill="FFFFFF"/>
+            <w:tcMar>
+              <w:top w:w="80" w:type="dxa"/>
+              <w:bottom w:w="80" w:type="dxa"/>
+              <w:left w:w="90" w:type="dxa"/>
+              <w:right w:w="90" w:type="dxa"/>
+            </w:tcMar>
+          </w:tcPr>
+          <w:p>
+            <w:pPr>
+              <w:spacing w:after="0" w:line="252" w:lineRule="auto"/>
+            </w:pPr>
+            <w:r>
+              <w:rPr>
+                <w:b w:val="0"/>
+                <w:color w:val="000000"/>
+                <w:sz w:val="19"/>
+              </w:rPr>
+              <w:t>Notify and report</w:t>
+            </w:r>
+          </w:p>
+        </w:tc>
+        <w:tc>
+          <w:tcPr>
+            <w:tcW w:type="dxa" w:w="4205"/>
+            <w:vAlign w:val="center"/>
+            <w:shd w:fill="FFFFFF"/>
+            <w:tcMar>
+              <w:top w:w="80" w:type="dxa"/>
+              <w:bottom w:w="80" w:type="dxa"/>
+              <w:left w:w="90" w:type="dxa"/>
+              <w:right w:w="90" w:type="dxa"/>
+            </w:tcMar>
+          </w:tcPr>
+          <w:p>
+            <w:pPr>
+              <w:spacing w:after="0" w:line="252" w:lineRule="auto"/>
+            </w:pPr>
+            <w:r>
+              <w:rPr>
+                <w:b w:val="0"/>
+                <w:color w:val="000000"/>
+                <w:sz w:val="19"/>
+              </w:rPr>
+              <w:t>UC-29 Read status notifications, UC-26 Generate an operational report, UC-28 Generate a sustainability report, UC-38 Summarize recorded activity</w:t>
+            </w:r>
+          </w:p>
+        </w:tc>
+        <w:tc>
+          <w:tcPr>
+            <w:tcW w:type="dxa" w:w="3995"/>
+            <w:vAlign w:val="center"/>
+            <w:shd w:fill="FFFFFF"/>
+            <w:tcMar>
+              <w:top w:w="80" w:type="dxa"/>
+              <w:bottom w:w="80" w:type="dxa"/>
+              <w:left w:w="90" w:type="dxa"/>
+              <w:right w:w="90" w:type="dxa"/>
+            </w:tcMar>
+          </w:tcPr>
+          <w:p>
+            <w:pPr>
+              <w:spacing w:after="0" w:line="252" w:lineRule="auto"/>
+            </w:pPr>
+            <w:r>
+              <w:rPr>
+                <w:b w:val="0"/>
+                <w:color w:val="000000"/>
+                <w:sz w:val="19"/>
+              </w:rPr>
+              <w:t>Ali, Humaid</w:t>
+            </w:r>
+          </w:p>
+        </w:tc>
+      </w:tr>
+    </w:tbl>
+    <w:p>
+      <w:pPr>
+        <w:spacing w:after="40"/>
+      </w:pPr>
+    </w:p>
+    <w:p>
+      <w:pPr/>
+      <w:r>
+        <w:t>These 19 use cases carry 61 of the 121 P3-FR clauses. Prototype 1 implements each one's main flow and the exceptions that protect data: invalid input, missing permission, unavailable quantity and AI failure. The other alternative flows follow in the later increment.</w:t>
+      </w:r>
+    </w:p>
+    <w:tbl>
+      <w:tblPr>
+        <w:tblW w:type="auto" w:w="0"/>
+        <w:jc w:val="center"/>
+        <w:tblLayout w:type="fixed"/>
+        <w:tblLook w:firstColumn="1" w:firstRow="1" w:lastColumn="0" w:lastRow="0" w:noHBand="0" w:noVBand="1" w:val="04A0"/>
+        <w:tblBorders>
+          <w:top w:val="single" w:sz="4" w:color="D9D9D9"/>
+          <w:left w:val="single" w:sz="4" w:color="D9D9D9"/>
+          <w:bottom w:val="single" w:sz="4" w:color="D9D9D9"/>
+          <w:right w:val="single" w:sz="4" w:color="D9D9D9"/>
+          <w:insideH w:val="single" w:sz="4" w:color="D9D9D9"/>
+          <w:insideV w:val="single" w:sz="4" w:color="D9D9D9"/>
+        </w:tblBorders>
+      </w:tblPr>
+      <w:tblGrid>
+        <w:gridCol w:w="3504"/>
+        <w:gridCol w:w="3504"/>
+        <w:gridCol w:w="3504"/>
+      </w:tblGrid>
+      <w:tr>
+        <w:trPr>
+          <w:cantSplit/>
+          <w:tblHeader/>
+        </w:trPr>
+        <w:tc>
+          <w:tcPr>
+            <w:tcW w:type="dxa" w:w="2313"/>
+            <w:vAlign w:val="center"/>
+            <w:shd w:fill="21364B"/>
+            <w:tcMar>
+              <w:top w:w="80" w:type="dxa"/>
+              <w:bottom w:w="80" w:type="dxa"/>
+              <w:left w:w="90" w:type="dxa"/>
+              <w:right w:w="90" w:type="dxa"/>
+            </w:tcMar>
+          </w:tcPr>
+          <w:p>
+            <w:pPr>
+              <w:spacing w:after="0" w:line="252" w:lineRule="auto"/>
+            </w:pPr>
+            <w:r>
+              <w:rPr>
+                <w:b/>
+                <w:color w:val="FFFFFF"/>
+                <w:sz w:val="19"/>
+              </w:rPr>
+              <w:t>Non-functional area</w:t>
+            </w:r>
+          </w:p>
+        </w:tc>
+        <w:tc>
+          <w:tcPr>
+            <w:tcW w:type="dxa" w:w="4205"/>
+            <w:vAlign w:val="center"/>
+            <w:shd w:fill="21364B"/>
+            <w:tcMar>
+              <w:top w:w="80" w:type="dxa"/>
+              <w:bottom w:w="80" w:type="dxa"/>
+              <w:left w:w="90" w:type="dxa"/>
+              <w:right w:w="90" w:type="dxa"/>
+            </w:tcMar>
+          </w:tcPr>
+          <w:p>
+            <w:pPr>
+              <w:spacing w:after="0" w:line="252" w:lineRule="auto"/>
+            </w:pPr>
+            <w:r>
+              <w:rPr>
+                <w:b/>
+                <w:color w:val="FFFFFF"/>
+                <w:sz w:val="19"/>
+              </w:rPr>
+              <w:t>Prototype 1 requirements</w:t>
+            </w:r>
+          </w:p>
+        </w:tc>
+        <w:tc>
+          <w:tcPr>
+            <w:tcW w:type="dxa" w:w="3995"/>
+            <w:vAlign w:val="center"/>
+            <w:shd w:fill="21364B"/>
+            <w:tcMar>
+              <w:top w:w="80" w:type="dxa"/>
+              <w:bottom w:w="80" w:type="dxa"/>
+              <w:left w:w="90" w:type="dxa"/>
+              <w:right w:w="90" w:type="dxa"/>
+            </w:tcMar>
+          </w:tcPr>
+          <w:p>
+            <w:pPr>
+              <w:spacing w:after="0" w:line="252" w:lineRule="auto"/>
+            </w:pPr>
+            <w:r>
+              <w:rPr>
+                <w:b/>
+                <w:color w:val="FFFFFF"/>
+                <w:sz w:val="19"/>
+              </w:rPr>
+              <w:t>Why first</w:t>
+            </w:r>
+          </w:p>
+        </w:tc>
+      </w:tr>
+      <w:tr>
+        <w:trPr>
+          <w:cantSplit/>
+        </w:trPr>
+        <w:tc>
+          <w:tcPr>
+            <w:tcW w:type="dxa" w:w="2313"/>
+            <w:vAlign w:val="center"/>
+            <w:shd w:fill="FFFFFF"/>
+            <w:tcMar>
+              <w:top w:w="80" w:type="dxa"/>
+              <w:bottom w:w="80" w:type="dxa"/>
+              <w:left w:w="90" w:type="dxa"/>
+              <w:right w:w="90" w:type="dxa"/>
+            </w:tcMar>
+          </w:tcPr>
+          <w:p>
+            <w:pPr>
+              <w:spacing w:after="0" w:line="252" w:lineRule="auto"/>
+            </w:pPr>
+            <w:r>
+              <w:rPr>
+                <w:b w:val="0"/>
+                <w:color w:val="000000"/>
+                <w:sz w:val="19"/>
+              </w:rPr>
+              <w:t>Performance</w:t>
+            </w:r>
+          </w:p>
+        </w:tc>
+        <w:tc>
+          <w:tcPr>
+            <w:tcW w:type="dxa" w:w="4205"/>
+            <w:vAlign w:val="center"/>
+            <w:shd w:fill="FFFFFF"/>
+            <w:tcMar>
+              <w:top w:w="80" w:type="dxa"/>
+              <w:bottom w:w="80" w:type="dxa"/>
+              <w:left w:w="90" w:type="dxa"/>
+              <w:right w:w="90" w:type="dxa"/>
+            </w:tcMar>
+          </w:tcPr>
+          <w:p>
+            <w:pPr>
+              <w:spacing w:after="0" w:line="252" w:lineRule="auto"/>
+            </w:pPr>
+            <w:r>
+              <w:rPr>
+                <w:b w:val="0"/>
+                <w:color w:val="000000"/>
+                <w:sz w:val="19"/>
+              </w:rPr>
+              <w:t>P3-NFR-P01 search time, P3-NFR-P02 semantic match time, P3-NFR-P05 no double reservation</w:t>
+            </w:r>
+          </w:p>
+        </w:tc>
+        <w:tc>
+          <w:tcPr>
+            <w:tcW w:type="dxa" w:w="3995"/>
+            <w:vAlign w:val="center"/>
+            <w:shd w:fill="FFFFFF"/>
+            <w:tcMar>
+              <w:top w:w="80" w:type="dxa"/>
+              <w:bottom w:w="80" w:type="dxa"/>
+              <w:left w:w="90" w:type="dxa"/>
+              <w:right w:w="90" w:type="dxa"/>
+            </w:tcMar>
+          </w:tcPr>
+          <w:p>
+            <w:pPr>
+              <w:spacing w:after="0" w:line="252" w:lineRule="auto"/>
+            </w:pPr>
+            <w:r>
+              <w:rPr>
+                <w:b w:val="0"/>
+                <w:color w:val="000000"/>
+                <w:sz w:val="19"/>
+              </w:rPr>
+              <w:t>These are visible in the demo and test the core exchange</w:t>
+            </w:r>
+          </w:p>
+        </w:tc>
+      </w:tr>
+      <w:tr>
+        <w:trPr>
+          <w:cantSplit/>
+        </w:trPr>
+        <w:tc>
+          <w:tcPr>
+            <w:tcW w:type="dxa" w:w="2313"/>
+            <w:vAlign w:val="center"/>
+            <w:shd w:fill="F3F6F8"/>
+            <w:tcMar>
+              <w:top w:w="80" w:type="dxa"/>
+              <w:bottom w:w="80" w:type="dxa"/>
+              <w:left w:w="90" w:type="dxa"/>
+              <w:right w:w="90" w:type="dxa"/>
+            </w:tcMar>
+          </w:tcPr>
+          <w:p>
+            <w:pPr>
+              <w:spacing w:after="0" w:line="252" w:lineRule="auto"/>
+            </w:pPr>
+            <w:r>
+              <w:rPr>
+                <w:b w:val="0"/>
+                <w:color w:val="000000"/>
+                <w:sz w:val="19"/>
+              </w:rPr>
+              <w:t>Safety</w:t>
+            </w:r>
+          </w:p>
+        </w:tc>
+        <w:tc>
+          <w:tcPr>
+            <w:tcW w:type="dxa" w:w="4205"/>
+            <w:vAlign w:val="center"/>
+            <w:shd w:fill="F3F6F8"/>
+            <w:tcMar>
+              <w:top w:w="80" w:type="dxa"/>
+              <w:bottom w:w="80" w:type="dxa"/>
+              <w:left w:w="90" w:type="dxa"/>
+              <w:right w:w="90" w:type="dxa"/>
+            </w:tcMar>
+          </w:tcPr>
+          <w:p>
+            <w:pPr>
+              <w:spacing w:after="0" w:line="252" w:lineRule="auto"/>
+            </w:pPr>
+            <w:r>
+              <w:rPr>
+                <w:b w:val="0"/>
+                <w:color w:val="000000"/>
+                <w:sz w:val="19"/>
+              </w:rPr>
+              <w:t>P3-NFR-S01 unsafe assets excluded, P3-NFR-S02 inspection before return to service, P3-NFR-S03 AI never approves</w:t>
+            </w:r>
+          </w:p>
+        </w:tc>
+        <w:tc>
+          <w:tcPr>
+            <w:tcW w:type="dxa" w:w="3995"/>
+            <w:vAlign w:val="center"/>
+            <w:shd w:fill="F3F6F8"/>
+            <w:tcMar>
+              <w:top w:w="80" w:type="dxa"/>
+              <w:bottom w:w="80" w:type="dxa"/>
+              <w:left w:w="90" w:type="dxa"/>
+              <w:right w:w="90" w:type="dxa"/>
+            </w:tcMar>
+          </w:tcPr>
+          <w:p>
+            <w:pPr>
+              <w:spacing w:after="0" w:line="252" w:lineRule="auto"/>
+            </w:pPr>
+            <w:r>
+              <w:rPr>
+                <w:b w:val="0"/>
+                <w:color w:val="000000"/>
+                <w:sz w:val="19"/>
+              </w:rPr>
+              <w:t>Each prevents a wrong physical action</w:t>
+            </w:r>
+          </w:p>
+        </w:tc>
+      </w:tr>
+      <w:tr>
+        <w:trPr>
+          <w:cantSplit/>
+        </w:trPr>
+        <w:tc>
+          <w:tcPr>
+            <w:tcW w:type="dxa" w:w="2313"/>
+            <w:vAlign w:val="center"/>
+            <w:shd w:fill="FFFFFF"/>
+            <w:tcMar>
+              <w:top w:w="80" w:type="dxa"/>
+              <w:bottom w:w="80" w:type="dxa"/>
+              <w:left w:w="90" w:type="dxa"/>
+              <w:right w:w="90" w:type="dxa"/>
+            </w:tcMar>
+          </w:tcPr>
+          <w:p>
+            <w:pPr>
+              <w:spacing w:after="0" w:line="252" w:lineRule="auto"/>
+            </w:pPr>
+            <w:r>
+              <w:rPr>
+                <w:b w:val="0"/>
+                <w:color w:val="000000"/>
+                <w:sz w:val="19"/>
+              </w:rPr>
+              <w:t>Security</w:t>
+            </w:r>
+          </w:p>
+        </w:tc>
+        <w:tc>
+          <w:tcPr>
+            <w:tcW w:type="dxa" w:w="4205"/>
+            <w:vAlign w:val="center"/>
+            <w:shd w:fill="FFFFFF"/>
+            <w:tcMar>
+              <w:top w:w="80" w:type="dxa"/>
+              <w:bottom w:w="80" w:type="dxa"/>
+              <w:left w:w="90" w:type="dxa"/>
+              <w:right w:w="90" w:type="dxa"/>
+            </w:tcMar>
+          </w:tcPr>
+          <w:p>
+            <w:pPr>
+              <w:spacing w:after="0" w:line="252" w:lineRule="auto"/>
+            </w:pPr>
+            <w:r>
+              <w:rPr>
+                <w:b w:val="0"/>
+                <w:color w:val="000000"/>
+                <w:sz w:val="19"/>
+              </w:rPr>
+              <w:t>P3-NFR-SEC01 server-side permission checks, P3-NFR-SEC02 hashed passwords, P3-NFR-SEC08 synthetic data only</w:t>
+            </w:r>
+          </w:p>
+        </w:tc>
+        <w:tc>
+          <w:tcPr>
+            <w:tcW w:type="dxa" w:w="3995"/>
+            <w:vAlign w:val="center"/>
+            <w:shd w:fill="FFFFFF"/>
+            <w:tcMar>
+              <w:top w:w="80" w:type="dxa"/>
+              <w:bottom w:w="80" w:type="dxa"/>
+              <w:left w:w="90" w:type="dxa"/>
+              <w:right w:w="90" w:type="dxa"/>
+            </w:tcMar>
+          </w:tcPr>
+          <w:p>
+            <w:pPr>
+              <w:spacing w:after="0" w:line="252" w:lineRule="auto"/>
+            </w:pPr>
+            <w:r>
+              <w:rPr>
+                <w:b w:val="0"/>
+                <w:color w:val="000000"/>
+                <w:sz w:val="19"/>
+              </w:rPr>
+              <w:t>Minimum protection for any login-based prototype</w:t>
+            </w:r>
+          </w:p>
+        </w:tc>
+      </w:tr>
+      <w:tr>
+        <w:trPr>
+          <w:cantSplit/>
+        </w:trPr>
+        <w:tc>
+          <w:tcPr>
+            <w:tcW w:type="dxa" w:w="2313"/>
+            <w:vAlign w:val="center"/>
+            <w:shd w:fill="F3F6F8"/>
+            <w:tcMar>
+              <w:top w:w="80" w:type="dxa"/>
+              <w:bottom w:w="80" w:type="dxa"/>
+              <w:left w:w="90" w:type="dxa"/>
+              <w:right w:w="90" w:type="dxa"/>
+            </w:tcMar>
+          </w:tcPr>
+          <w:p>
+            <w:pPr>
+              <w:spacing w:after="0" w:line="252" w:lineRule="auto"/>
+            </w:pPr>
+            <w:r>
+              <w:rPr>
+                <w:b w:val="0"/>
+                <w:color w:val="000000"/>
+                <w:sz w:val="19"/>
+              </w:rPr>
+              <w:t>Quality</w:t>
+            </w:r>
+          </w:p>
+        </w:tc>
+        <w:tc>
+          <w:tcPr>
+            <w:tcW w:type="dxa" w:w="4205"/>
+            <w:vAlign w:val="center"/>
+            <w:shd w:fill="F3F6F8"/>
+            <w:tcMar>
+              <w:top w:w="80" w:type="dxa"/>
+              <w:bottom w:w="80" w:type="dxa"/>
+              <w:left w:w="90" w:type="dxa"/>
+              <w:right w:w="90" w:type="dxa"/>
+            </w:tcMar>
+          </w:tcPr>
+          <w:p>
+            <w:pPr>
+              <w:spacing w:after="0" w:line="252" w:lineRule="auto"/>
+            </w:pPr>
+            <w:r>
+              <w:rPr>
+                <w:b w:val="0"/>
+                <w:color w:val="000000"/>
+                <w:sz w:val="19"/>
+              </w:rPr>
+              <w:t>P3-NFR-Q02 keyboard access, P3-NFR-Q03 calculation fixtures, P3-NFR-Q06 AI fallback, P3-NFR-Q10 field errors</w:t>
+            </w:r>
+          </w:p>
+        </w:tc>
+        <w:tc>
+          <w:tcPr>
+            <w:tcW w:type="dxa" w:w="3995"/>
+            <w:vAlign w:val="center"/>
+            <w:shd w:fill="F3F6F8"/>
+            <w:tcMar>
+              <w:top w:w="80" w:type="dxa"/>
+              <w:bottom w:w="80" w:type="dxa"/>
+              <w:left w:w="90" w:type="dxa"/>
+              <w:right w:w="90" w:type="dxa"/>
+            </w:tcMar>
+          </w:tcPr>
+          <w:p>
+            <w:pPr>
+              <w:spacing w:after="0" w:line="252" w:lineRule="auto"/>
+            </w:pPr>
+            <w:r>
+              <w:rPr>
+                <w:b w:val="0"/>
+                <w:color w:val="000000"/>
+                <w:sz w:val="19"/>
+              </w:rPr>
+              <w:t>Needed for the demo to be usable and its numbers trusted</w:t>
+            </w:r>
+          </w:p>
+        </w:tc>
+      </w:tr>
+    </w:tbl>
+    <w:p>
+      <w:pPr>
+        <w:spacing w:after="40"/>
+      </w:pPr>
+    </w:p>
+    <w:p>
+      <w:pPr/>
+      <w:r>
+        <w:t>The later increment adds the remaining essential use cases: UC-02, UC-03, UC-05, UC-07, UC-09, UC-11, UC-12, UC-15, UC-18, UC-21, UC-23 to UC-25, UC-27, UC-30, UC-36 and UC-37, plus the other 17 non-functional requirements. UC-33 and UC-34 stay desirable extensions. No requirement is removed; this ordering only decides what is built and demonstrated first.</w:t>
+      </w:r>
+    </w:p>
+    <w:p>
+      <w:pPr>
+        <w:pStyle w:val="Heading2"/>
+      </w:pPr>
+      <w:r>
         <w:t>Functional ownership and actor permissions</w:t>
       </w:r>
     </w:p>
     <w:p>
       <w:pPr/>
       <w:r>
-        <w:t>The proposed functional owner is a KU-designated Asset Management Lead who would approve business requirements and operating rules. This names a responsibility, not a confirmed KU title or individual. The student team does not own university assets or institutional policy. An instructor-approved proxy may review scenarios, but cannot authorize a live transfer or establish KU policy. A user may hold more than one assigned role, subject to separation of approval duties.</w:t>
+        <w:t>The proposed functional owner is a KU-designated Asset Management Lead who would approve business requirements and operating rules. This names a responsibility, not a confirmed KU title or individual. The student team does not own university assets or institutional policy. A user may hold more than one assigned role, subject to separation of approval duties.</w:t>
       </w:r>
     </w:p>
     <w:tbl>
@@ -10590,7 +11735,7 @@
         <w:rPr>
           <w:sz w:val="21"/>
         </w:rPr>
-        <w:t>Priority: Essential. Parent group: FR-01. Proposed verification owner: Ali Alawadhi.</w:t>
+        <w:t>Priority: Essential, Prototype 1. Parent group: FR-01. Proposed verification owner: Ali Alawadhi.</w:t>
       </w:r>
     </w:p>
     <w:p>
@@ -10882,7 +12027,7 @@
         <w:rPr>
           <w:sz w:val="21"/>
         </w:rPr>
-        <w:t>Priority: Essential. Parent group: FR-01. Proposed verification owner: Ali Alawadhi.</w:t>
+        <w:t>Priority: Essential, later increment. Parent group: FR-01. Proposed verification owner: Ali Alawadhi.</w:t>
       </w:r>
     </w:p>
     <w:p>
@@ -11174,7 +12319,7 @@
         <w:rPr>
           <w:sz w:val="21"/>
         </w:rPr>
-        <w:t>Priority: Essential. Parent group: FR-02. Proposed verification owner: Ali Alawadhi.</w:t>
+        <w:t>Priority: Essential, later increment. Parent group: FR-02. Proposed verification owner: Ali Alawadhi.</w:t>
       </w:r>
     </w:p>
     <w:p>
@@ -11477,7 +12622,7 @@
         <w:rPr>
           <w:sz w:val="21"/>
         </w:rPr>
-        <w:t>Priority: Essential. Parent group: FR-02. Proposed verification owner: Saeed Alkaabi.</w:t>
+        <w:t>Priority: Essential, Prototype 1. Parent group: FR-02. Proposed verification owner: Saeed Alkaabi.</w:t>
       </w:r>
     </w:p>
     <w:p>
@@ -11780,7 +12925,7 @@
         <w:rPr>
           <w:sz w:val="21"/>
         </w:rPr>
-        <w:t>Priority: Essential. Parent group: FR-02. Proposed verification owner: Saeed Alkaabi.</w:t>
+        <w:t>Priority: Essential, later increment. Parent group: FR-02. Proposed verification owner: Saeed Alkaabi.</w:t>
       </w:r>
     </w:p>
     <w:p>
@@ -12072,7 +13217,7 @@
         <w:rPr>
           <w:sz w:val="21"/>
         </w:rPr>
-        <w:t>Priority: Essential. Parent group: FR-02. Proposed verification owner: Saeed Alkaabi.</w:t>
+        <w:t>Priority: Essential, Prototype 1. Parent group: FR-02. Proposed verification owner: Saeed Alkaabi.</w:t>
       </w:r>
     </w:p>
     <w:p>
@@ -12375,7 +13520,7 @@
         <w:rPr>
           <w:sz w:val="21"/>
         </w:rPr>
-        <w:t>Priority: Essential. Parent group: FR-02. Proposed verification owner: Saeed Alkaabi.</w:t>
+        <w:t>Priority: Essential, later increment. Parent group: FR-02. Proposed verification owner: Saeed Alkaabi.</w:t>
       </w:r>
     </w:p>
     <w:p>
@@ -12678,7 +13823,7 @@
         <w:rPr>
           <w:sz w:val="21"/>
         </w:rPr>
-        <w:t>Priority: Essential. Parent group: FR-03. Proposed verification owner: Ali Alawadhi.</w:t>
+        <w:t>Priority: Essential, Prototype 1. Parent group: FR-03. Proposed verification owner: Ali Alawadhi.</w:t>
       </w:r>
     </w:p>
     <w:p>
@@ -13014,7 +14159,7 @@
         <w:rPr>
           <w:sz w:val="21"/>
         </w:rPr>
-        <w:t>Priority: Essential. Parent group: FR-03. Proposed verification owner: Ali Alawadhi.</w:t>
+        <w:t>Priority: Essential, later increment. Parent group: FR-03. Proposed verification owner: Ali Alawadhi.</w:t>
       </w:r>
     </w:p>
     <w:p>
@@ -13316,7 +14461,7 @@
         <w:rPr>
           <w:sz w:val="21"/>
         </w:rPr>
-        <w:t>Priority: Essential. Parent group: FR-03. Proposed verification owner: Ali Alawadhi.</w:t>
+        <w:t>Priority: Essential, Prototype 1. Parent group: FR-03. Proposed verification owner: Ali Alawadhi.</w:t>
       </w:r>
     </w:p>
     <w:p>
@@ -13608,7 +14753,7 @@
         <w:rPr>
           <w:sz w:val="21"/>
         </w:rPr>
-        <w:t>Priority: Essential. Parent group: FR-03. Proposed verification owner: Ali Alawadhi.</w:t>
+        <w:t>Priority: Essential, later increment. Parent group: FR-03. Proposed verification owner: Ali Alawadhi.</w:t>
       </w:r>
     </w:p>
     <w:p>
@@ -13900,7 +15045,7 @@
         <w:rPr>
           <w:sz w:val="21"/>
         </w:rPr>
-        <w:t>Priority: Essential. Parent group: FR-04. Proposed verification owner: Saeed Alkaabi.</w:t>
+        <w:t>Priority: Essential, later increment. Parent group: FR-04. Proposed verification owner: Saeed Alkaabi.</w:t>
       </w:r>
     </w:p>
     <w:p>
@@ -14192,7 +15337,7 @@
         <w:rPr>
           <w:sz w:val="21"/>
         </w:rPr>
-        <w:t>Priority: Essential. Parent group: FR-04. Proposed verification owner: Saeed Alkaabi.</w:t>
+        <w:t>Priority: Essential, Prototype 1. Parent group: FR-04. Proposed verification owner: Saeed Alkaabi.</w:t>
       </w:r>
     </w:p>
     <w:p>
@@ -14484,7 +15629,7 @@
         <w:rPr>
           <w:sz w:val="21"/>
         </w:rPr>
-        <w:t>Priority: Essential. Parent group: FR-04. Proposed verification owner: Saeed Alkaabi.</w:t>
+        <w:t>Priority: Essential, Prototype 1. Parent group: FR-04. Proposed verification owner: Saeed Alkaabi.</w:t>
       </w:r>
     </w:p>
     <w:p>
@@ -14810,7 +15955,7 @@
         <w:rPr>
           <w:sz w:val="21"/>
         </w:rPr>
-        <w:t>Priority: Essential. Parent group: FR-04. Proposed verification owner: Saeed Alkaabi.</w:t>
+        <w:t>Priority: Essential, later increment. Parent group: FR-04. Proposed verification owner: Saeed Alkaabi.</w:t>
       </w:r>
     </w:p>
     <w:p>
@@ -15125,7 +16270,7 @@
         <w:rPr>
           <w:sz w:val="21"/>
         </w:rPr>
-        <w:t>Priority: Essential. Parent group: FR-04. Proposed verification owner: Saeed Alkaabi.</w:t>
+        <w:t>Priority: Essential, Prototype 1. Parent group: FR-04. Proposed verification owner: Saeed Alkaabi.</w:t>
       </w:r>
     </w:p>
     <w:p>
@@ -15452,7 +16597,7 @@
         <w:rPr>
           <w:sz w:val="21"/>
         </w:rPr>
-        <w:t>Priority: Essential. Parent group: FR-04. Proposed verification owner: Saeed Alkaabi.</w:t>
+        <w:t>Priority: Essential, Prototype 1. Parent group: FR-04. Proposed verification owner: Saeed Alkaabi.</w:t>
       </w:r>
     </w:p>
     <w:p>
@@ -15767,7 +16912,7 @@
         <w:rPr>
           <w:sz w:val="21"/>
         </w:rPr>
-        <w:t>Priority: Essential. Parent group: FR-04. Proposed verification owner: Saeed Alkaabi.</w:t>
+        <w:t>Priority: Essential, later increment. Parent group: FR-04. Proposed verification owner: Saeed Alkaabi.</w:t>
       </w:r>
     </w:p>
     <w:p>
@@ -16105,7 +17250,7 @@
         <w:rPr>
           <w:sz w:val="21"/>
         </w:rPr>
-        <w:t>Priority: Essential. Parent group: FR-05. Proposed verification owner: Ali Alawadhi.</w:t>
+        <w:t>Priority: Essential, Prototype 1. Parent group: FR-05. Proposed verification owner: Ali Alawadhi.</w:t>
       </w:r>
     </w:p>
     <w:p>
@@ -16431,7 +17576,7 @@
         <w:rPr>
           <w:sz w:val="21"/>
         </w:rPr>
-        <w:t>Priority: Essential. Parent group: FR-05. Proposed verification owner: Ali Alawadhi.</w:t>
+        <w:t>Priority: Essential, Prototype 1. Parent group: FR-05. Proposed verification owner: Ali Alawadhi.</w:t>
       </w:r>
     </w:p>
     <w:p>
@@ -16757,7 +17902,7 @@
         <w:rPr>
           <w:sz w:val="21"/>
         </w:rPr>
-        <w:t>Priority: Essential. Parent group: FR-05. Proposed verification owner: Ali Alawadhi.</w:t>
+        <w:t>Priority: Essential, later increment. Parent group: FR-05. Proposed verification owner: Ali Alawadhi.</w:t>
       </w:r>
     </w:p>
     <w:p>
@@ -17105,7 +18250,7 @@
         <w:rPr>
           <w:sz w:val="21"/>
         </w:rPr>
-        <w:t>Priority: Essential. Parent group: FR-05. Proposed verification owner: Ali Alawadhi.</w:t>
+        <w:t>Priority: Essential, Prototype 1. Parent group: FR-05. Proposed verification owner: Ali Alawadhi.</w:t>
       </w:r>
     </w:p>
     <w:p>
@@ -17442,7 +18587,7 @@
         <w:rPr>
           <w:sz w:val="21"/>
         </w:rPr>
-        <w:t>Priority: Essential. Parent group: FR-05. Proposed verification owner: Humaid Al Ali.</w:t>
+        <w:t>Priority: Essential, later increment. Parent group: FR-05. Proposed verification owner: Humaid Al Ali.</w:t>
       </w:r>
     </w:p>
     <w:p>
@@ -17768,7 +18913,7 @@
         <w:rPr>
           <w:sz w:val="21"/>
         </w:rPr>
-        <w:t>Priority: Essential. Parent group: FR-05. Proposed verification owner: Humaid Al Ali.</w:t>
+        <w:t>Priority: Essential, later increment. Parent group: FR-05. Proposed verification owner: Humaid Al Ali.</w:t>
       </w:r>
     </w:p>
     <w:p>
@@ -18094,7 +19239,7 @@
         <w:rPr>
           <w:sz w:val="21"/>
         </w:rPr>
-        <w:t>Priority: Essential. Parent group: FR-05. Proposed verification owner: Humaid Al Ali.</w:t>
+        <w:t>Priority: Essential, later increment. Parent group: FR-05. Proposed verification owner: Humaid Al Ali.</w:t>
       </w:r>
     </w:p>
     <w:p>
@@ -18409,7 +19554,7 @@
         <w:rPr>
           <w:sz w:val="21"/>
         </w:rPr>
-        <w:t>Priority: Essential. Parent group: FR-06. Proposed verification owner: Humaid Al Ali.</w:t>
+        <w:t>Priority: Essential, Prototype 1. Parent group: FR-06. Proposed verification owner: Humaid Al Ali.</w:t>
       </w:r>
     </w:p>
     <w:p>
@@ -18713,7 +19858,7 @@
         <w:rPr>
           <w:sz w:val="21"/>
         </w:rPr>
-        <w:t>Priority: Essential. Parent group: FR-06. Proposed verification owner: Humaid Al Ali.</w:t>
+        <w:t>Priority: Essential, later increment. Parent group: FR-06. Proposed verification owner: Humaid Al Ali.</w:t>
       </w:r>
     </w:p>
     <w:p>
@@ -19028,7 +20173,7 @@
         <w:rPr>
           <w:sz w:val="21"/>
         </w:rPr>
-        <w:t>Priority: Essential. Parent group: FR-06. Proposed verification owner: Humaid Al Ali.</w:t>
+        <w:t>Priority: Essential, Prototype 1. Parent group: FR-06. Proposed verification owner: Humaid Al Ali.</w:t>
       </w:r>
     </w:p>
     <w:p>
@@ -19343,7 +20488,7 @@
         <w:rPr>
           <w:sz w:val="21"/>
         </w:rPr>
-        <w:t>Priority: Essential. Parent group: FR-06. Proposed verification owner: Ali Alawadhi.</w:t>
+        <w:t>Priority: Essential, Prototype 1. Parent group: FR-06. Proposed verification owner: Ali Alawadhi.</w:t>
       </w:r>
     </w:p>
     <w:p>
@@ -19646,7 +20791,7 @@
         <w:rPr>
           <w:sz w:val="21"/>
         </w:rPr>
-        <w:t>Priority: Essential. Parent group: FR-06. Proposed verification owner: Ali Alawadhi.</w:t>
+        <w:t>Priority: Essential, later increment. Parent group: FR-06. Proposed verification owner: Ali Alawadhi.</w:t>
       </w:r>
     </w:p>
     <w:p>
@@ -19961,7 +21106,7 @@
         <w:rPr>
           <w:sz w:val="21"/>
         </w:rPr>
-        <w:t>Priority: Essential. Parent group: AI-01. Proposed verification owner: Humaid Al Ali.</w:t>
+        <w:t>Priority: Essential, Prototype 1. Parent group: AI-01. Proposed verification owner: Humaid Al Ali.</w:t>
       </w:r>
     </w:p>
     <w:p>
@@ -20287,7 +21432,7 @@
         <w:rPr>
           <w:sz w:val="21"/>
         </w:rPr>
-        <w:t>Priority: Essential. Parent group: AI-02. Proposed verification owner: Humaid Al Ali.</w:t>
+        <w:t>Priority: Essential, Prototype 1. Parent group: AI-02. Proposed verification owner: Humaid Al Ali.</w:t>
       </w:r>
     </w:p>
     <w:p>
@@ -21221,7 +22366,7 @@
         <w:rPr>
           <w:sz w:val="21"/>
         </w:rPr>
-        <w:t>Priority: Essential. Parent group: AI-01 to AI-05. Proposed verification owner: Humaid Al Ali.</w:t>
+        <w:t>Priority: Essential, Prototype 1. Parent group: AI-01 to AI-05. Proposed verification owner: Humaid Al Ali.</w:t>
       </w:r>
     </w:p>
     <w:p>
@@ -21547,7 +22692,7 @@
         <w:rPr>
           <w:sz w:val="21"/>
         </w:rPr>
-        <w:t>Priority: Essential. Parent group: AI-01 to AI-05. Proposed verification owner: Saeed Alkaabi.</w:t>
+        <w:t>Priority: Essential, later increment. Parent group: AI-01 to AI-05. Proposed verification owner: Saeed Alkaabi.</w:t>
       </w:r>
     </w:p>
     <w:p>
@@ -21873,7 +23018,7 @@
         <w:rPr>
           <w:sz w:val="21"/>
         </w:rPr>
-        <w:t>Priority: Essential. Parent group: FR-01. Proposed verification owner: Saeed Alkaabi.</w:t>
+        <w:t>Priority: Essential, later increment. Parent group: FR-01. Proposed verification owner: Saeed Alkaabi.</w:t>
       </w:r>
     </w:p>
     <w:p>
@@ -22211,7 +23356,7 @@
         <w:rPr>
           <w:sz w:val="21"/>
         </w:rPr>
-        <w:t>Priority: Essential. Parent group: AI-05. Proposed verification owner: Humaid Al Ali.</w:t>
+        <w:t>Priority: Essential, Prototype 1. Parent group: AI-05. Proposed verification owner: Humaid Al Ali.</w:t>
       </w:r>
     </w:p>
     <w:p>
@@ -26865,7 +28010,7 @@
     <w:p>
       <w:pPr/>
       <w:r>
-        <w:t>For illustration only, the Phase 2 model assumes AED 800 of avoided purchasing cost minus AED 150 repair and AED 50 transfer cost, giving AED 600 net benefit per qualifying event [3]. Twenty such events would yield AED 12,000 net avoided purchasing cost before project costs; subtracting the Phase 2 first-year economic cost of AED 9,120 gives AED 2,880. These values motivate traceable input and report requirements, not a claim of achieved KU savings. The prototype shall store the inputs needed to replace these assumptions with authorized evidence.</w:t>
+        <w:t>The figures below are synthetic test values chosen by the team to exercise the calculations; they are not market prices or KU records. They assume AED 800 of avoided purchasing cost minus AED 150 repair and AED 50 transfer cost, giving AED 600 net benefit per qualifying event, as used in the Phase 2 scenario [3]. Real baselines must come from finance-validated purchase records under P3-XR-09. Twenty such events would yield AED 12,000 net avoided purchasing cost before project costs; subtracting the Phase 2 first-year economic cost of AED 9,120 gives AED 2,880. These values motivate traceable input and report requirements, not a claim of achieved KU savings. The prototype shall store the inputs needed to replace these assumptions with authorized evidence.</w:t>
       </w:r>
     </w:p>
     <w:p>
@@ -30415,7 +31560,7 @@
     <w:p>
       <w:pPr/>
       <w:r>
-        <w:t>Document analysis and the simulated stakeholder interview in Appendix A provide the requirements-elicitation evidence for this classroom report. The professor permits an interview scenario, so a real interview is not an outstanding assignment prerequisite. The scenario links specific stakeholder needs to existing requirements and test conditions; it is not a claim of empirical validation. The following institutional decisions matter if the prototype is later considered for live use. Sections 3 and 4 already define testable prototype behaviour using fictional records.</w:t>
+        <w:t>Document analysis and the simulated stakeholder interview in Appendix A provide the requirements-elicitation evidence for this report. The scenario links specific stakeholder needs to existing requirements and test conditions; it is not a claim of empirical validation. The following institutional decisions matter if the prototype is later considered for live use. Sections 3 and 4 already define testable prototype behaviour using fictional records.</w:t>
       </w:r>
     </w:p>
     <w:tbl>
@@ -30989,7 +32134,7 @@
                 <w:color w:val="000000"/>
                 <w:sz w:val="19"/>
               </w:rPr>
-              <w:t>Language constraint from slides; no selected adaptation or AI provider claimed</w:t>
+              <w:t>Python, Java or C++ required; no selected adaptation or AI provider claimed</w:t>
             </w:r>
           </w:p>
         </w:tc>
@@ -31098,7 +32243,7 @@
                 <w:color w:val="000000"/>
                 <w:sz w:val="19"/>
               </w:rPr>
-              <w:t>Review scenario consistency and coverage for the course; seek authorized stakeholder confirmation only for a later live pilot; Ali</w:t>
+              <w:t>Review scenario consistency and coverage; seek authorized stakeholder confirmation only for a later live pilot; Ali</w:t>
             </w:r>
           </w:p>
         </w:tc>
@@ -31524,7 +32669,7 @@
     <w:p>
       <w:pPr/>
       <w:r>
-        <w:t>We used OpenAI Codex to assist substantially with analysing the supplied project materials, drafting requirements and use-case descriptions, checking consistency across rules and states, preparing the diagram, identifying relevant external guidance, and formatting this report. AI also assisted in constructing the fictional stakeholder interview questions and simulated answers, mapping them to requirements, and checking coverage against the TA's notes. The interview scenario is an educational elicitation exercise, not a transcript of an actual consultation. No AI-generated statement establishes tested implementation, university approval or measured benefit. The three authors remain responsible for understanding the requirements, reviewing proposed rules and evidence, and approving the submission. Future AI-assisted code must be understood and tested by the responsible student.</w:t>
+        <w:t>We used OpenAI Codex to assist substantially with analysing the supplied project materials, drafting requirements and use-case descriptions, checking consistency across rules and states, preparing the diagram, identifying relevant external guidance, and formatting this report. AI also assisted in constructing the fictional stakeholder interview questions and simulated answers and mapping them to requirements. The interview scenario is an educational elicitation exercise, not a transcript of an actual consultation. No AI-generated statement establishes tested implementation, university approval or measured benefit. The three authors remain responsible for understanding the requirements, reviewing proposed rules and evidence, and approving the submission. Future AI-assisted code must be understood and tested by the responsible student.</w:t>
       </w:r>
     </w:p>
     <w:p>
@@ -31587,23 +32732,6 @@
         </w:r>
       </w:hyperlink>
       <w:r/>
-    </w:p>
-    <w:p>
-      <w:pPr/>
-      <w:r>
-        <w:t xml:space="preserve">[6] Khalifa University, “Due Phase 3,” COSC 336 Introduction to Software Engineering B3 Lab, Blackboard assignment _1449298_1, course _185135_1. Due date displayed as Oct. 13, 2026, 6:00 PM UTC+4 after the one-day extension announced Oct. 4, 2026. Accessed: Oct. 5, 2026. [Online]. Available: </w:t>
-      </w:r>
-      <w:hyperlink r:id="rId14">
-        <w:r>
-          <w:rPr>
-            <w:color w:val="174A78"/>
-          </w:rPr>
-          <w:t>https://elearn.ku.ac.ae/ultra/courses/_185135_1/assessment/_1449298_1/overview</w:t>
-        </w:r>
-      </w:hyperlink>
-      <w:r>
-        <w:t xml:space="preserve"> (authenticated course access).</w:t>
-      </w:r>
     </w:p>
     <w:p>
       <w:r>

</xml_diff>